<commit_message>
Add figures, correct the Fascia logic, use real report names
Section 5.4: correct the Fascia Studente CdS description to the real gold-layer
logic (four bands verde/giallo/rosso/nero, thresholds 11/22/33, N/D edge cases,
activity-level and programme-level variants) and add Listing 1, a sanitised SQL
extract with the student's personal attributes removed.

Section 5.5: use the six real report names from the Power BI workspace and add
two real dashboard figures from Report_Didattica (Home and Formazione), using
aggregate views only; pages showing individual students or staff are excluded.

Sections 5.1 and 5.2: add Figure 1 (end-to-end architecture) and Figure 2
(pipeline flow) diagrams. Rebuild the assembled Word document with the four
figures embedded, and refresh the progress tracker.

Co-Authored-By: Claude Opus 4.8 <noreply@anthropic.com>
Claude-Session: https://claude.ai/code/session_01Q8G8LfzNP8Qc7WF464q8wH
</commit_message>
<xml_diff>
--- a/Capobianco_Thesis_v1.docx
+++ b/Capobianco_Thesis_v1.docx
@@ -766,7 +766,7 @@
     </w:p>
     <w:p>
       <w:r>
-        <w:t xml:space="preserve">The end-to-end architecture has four layers, illustrated in Figure X:</w:t>
+        <w:t xml:space="preserve">The end-to-end architecture has four layers, illustrated in Figure 1:</w:t>
       </w:r>
     </w:p>
     <w:p>
@@ -822,93 +822,215 @@
       </w:r>
     </w:p>
     <w:p>
-      <w:r>
-        <w:t xml:space="preserve">Two clarifications on authorship are needed before the sections that follow. The semantic model and the DAX measures for the student careers domain were designed and implemented directly by the author, in collaboration with the KPMG delivery team; the team contributed to the overall architecture, to the design of the fact tables, and to the review of the modelling choices. The Snowflake medallion layers were built by the wider team, and the author's involvement in that part of the pipeline was limited to consuming the gold layer and to aligning with the team on the data structures it made available.</w:t>
-      </w:r>
-    </w:p>
-    <w:p>
-      <w:r>
-        <w:t xml:space="preserve">The remainder of the chapter follows the architecture in order. Section 5.2 describes the Snowflake medallion approach at a level of detail proportionate to its role in the thesis. Section 5.3 presents the semantic model, including the trade-offs adopted when a pure star-schema design was not feasible. Section 5.4 details the KPI catalogue for the student careers domain, Section 5.5 illustrates the Power BI implementation and its distribution model, and Section 5.6 discusses the data quality considerations that emerged during the project.</w:t>
-      </w:r>
-    </w:p>
-    <w:p>
-      <w:pPr>
-        <w:pStyle w:val="Heading2"/>
-      </w:pPr>
-      <w:r>
-        <w:t xml:space="preserve">5.2 Data architecture: the Snowflake medallion approach</w:t>
-      </w:r>
-    </w:p>
-    <w:p>
-      <w:r>
-        <w:t xml:space="preserve">The data platform underlying the Business Intelligence solution is built on Snowflake and organised according to the medallion architecture, a layered pattern that has become common practice for analytical data platforms in the last few years. The pattern was originally popularised in the Databricks Lakehouse but is now widely adopted also on Snowflake and on other cloud data warehouses, because it addresses two recurring needs in analytical pipelines: the separation between raw ingestion and analytical consumption, and the ability to reprocess or audit the data at each stage without touching the source systems. The medallion pattern separates the data flow into three progressively refined layers, conventionally named bronze, silver, and gold. The following description focuses on how the pattern is instantiated in the specific pipeline that feeds data from ESSE3 into the reporting layer used in this project.</w:t>
-      </w:r>
-    </w:p>
-    <w:p>
-      <w:pPr>
-        <w:pStyle w:val="Heading3"/>
-      </w:pPr>
-      <w:r>
-        <w:t xml:space="preserve">5.2.1 End-to-end flow</w:t>
-      </w:r>
-    </w:p>
-    <w:p>
-      <w:r>
-        <w:t xml:space="preserve">The pipeline moves data from the ESSE3 Oracle database into the Snowflake analytical platform through three sequential phases: an extraction phase carried out on an on-premise virtual machine, a bronze loading phase orchestrated within Snowflake, and a silver refinement phase implemented through stored procedures. The three phases are chained by a signalling mechanism designed around a fail-fast principle: if any phase does not complete correctly, the subsequent phases do not start, and the analytical layer keeps the data of the previous day rather than exposing partially updated information. The end-to-end flow is illustrated in Figure X.</w:t>
-      </w:r>
-    </w:p>
-    <w:p>
-      <w:pPr>
-        <w:pStyle w:val="Heading3"/>
-      </w:pPr>
-      <w:r>
-        <w:t xml:space="preserve">5.2.2 Extraction from ESSE3 to the Snowflake stage</w:t>
-      </w:r>
-    </w:p>
-    <w:p>
-      <w:r>
-        <w:t xml:space="preserve">The extraction phase runs each night, orchestrated by a bash script executed on an on-premise virtual machine. The script coordinates three sequential steps.</w:t>
-      </w:r>
-    </w:p>
-    <w:p>
-      <w:r>
-        <w:t xml:space="preserve">The first step is the </w:t>
-      </w:r>
+      <w:pPr>
+        <w:spacing w:after="40" w:before="160"/>
+        <w:jc w:val="center"/>
+      </w:pPr>
+      <w:r>
+        <w:drawing>
+          <wp:inline distT="0" distB="0" distL="0" distR="0">
+            <wp:extent cx="5334000" cy="6334125"/>
+            <wp:effectExtent t="0" r="0" b="0" l="0"/>
+            <wp:docPr id="1" name="" descr="" title=""/>
+            <wp:cNvGraphicFramePr>
+              <a:graphicFrameLocks xmlns:a="http://schemas.openxmlformats.org/drawingml/2006/main" noChangeAspect="1"/>
+            </wp:cNvGraphicFramePr>
+            <a:graphic xmlns:a="http://schemas.openxmlformats.org/drawingml/2006/main">
+              <a:graphicData uri="http://schemas.openxmlformats.org/drawingml/2006/picture">
+                <pic:pic xmlns:pic="http://schemas.openxmlformats.org/drawingml/2006/picture">
+                  <pic:nvPicPr>
+                    <pic:cNvPr id="0" name="" descr=""/>
+                    <pic:cNvPicPr>
+                      <a:picLocks noChangeAspect="1" noChangeArrowheads="1"/>
+                    </pic:cNvPicPr>
+                  </pic:nvPicPr>
+                  <pic:blipFill>
+                    <a:blip r:embed="rId9" cstate="none"/>
+                    <a:srcRect/>
+                    <a:stretch>
+                      <a:fillRect/>
+                    </a:stretch>
+                  </pic:blipFill>
+                  <pic:spPr bwMode="auto">
+                    <a:xfrm>
+                      <a:off x="0" y="0"/>
+                      <a:ext cx="5334000" cy="6334125"/>
+                    </a:xfrm>
+                    <a:prstGeom prst="rect">
+                      <a:avLst/>
+                    </a:prstGeom>
+                  </pic:spPr>
+                </pic:pic>
+              </a:graphicData>
+            </a:graphic>
+          </wp:inline>
+        </w:drawing>
+      </w:r>
+    </w:p>
+    <w:p>
+      <w:pPr>
+        <w:spacing w:after="220"/>
+        <w:jc w:val="center"/>
+      </w:pPr>
       <w:r>
         <w:rPr>
           <w:i/>
           <w:iCs/>
-        </w:rPr>
-        <w:t xml:space="preserve">spool</w:t>
-      </w:r>
-      <w:r>
-        <w:t xml:space="preserve">: a delimited text file is produced for each source table, driven by a per-table configuration file that specifies the extraction query. If any single table fails to spool, the step as a whole is marked as failed and the pipeline stops.</w:t>
-      </w:r>
-    </w:p>
-    <w:p>
-      <w:r>
-        <w:t xml:space="preserve">The second step is the </w:t>
-      </w:r>
+          <w:sz w:val="20"/>
+          <w:szCs w:val="20"/>
+        </w:rPr>
+        <w:t xml:space="preserve">Figure 1. End-to-end architecture of the solution, from the ESSE3 source system through the Snowflake medallion layers (bronze, silver, gold) to the Power BI semantic model and dashboards.</w:t>
+      </w:r>
+    </w:p>
+    <w:p>
+      <w:r>
+        <w:t xml:space="preserve">Two clarifications on authorship are needed before the sections that follow. The semantic model and the DAX measures for the student careers domain were designed and implemented directly by the author, in collaboration with the KPMG delivery team; the team contributed to the overall architecture, to the design of the fact tables, and to the review of the modelling choices. The Snowflake medallion layers were built by the wider team, and the author's involvement in that part of the pipeline was limited to consuming the gold layer and to aligning with the team on the data structures it made available.</w:t>
+      </w:r>
+    </w:p>
+    <w:p>
+      <w:r>
+        <w:t xml:space="preserve">The remainder of the chapter follows the architecture in order. Section 5.2 describes the Snowflake medallion approach at a level of detail proportionate to its role in the thesis. Section 5.3 presents the semantic model, including the trade-offs adopted when a pure star-schema design was not feasible. Section 5.4 details the KPI catalogue for the student careers domain, Section 5.5 illustrates the Power BI implementation and its distribution model, and Section 5.6 discusses the data quality considerations that emerged during the project.</w:t>
+      </w:r>
+    </w:p>
+    <w:p>
+      <w:pPr>
+        <w:pStyle w:val="Heading2"/>
+      </w:pPr>
+      <w:r>
+        <w:t xml:space="preserve">5.2 Data architecture: the Snowflake medallion approach</w:t>
+      </w:r>
+    </w:p>
+    <w:p>
+      <w:r>
+        <w:t xml:space="preserve">The data platform underlying the Business Intelligence solution is built on Snowflake and organised according to the medallion architecture, a layered pattern that has become common practice for analytical data platforms in the last few years. The pattern was originally popularised in the Databricks Lakehouse but is now widely adopted also on Snowflake and on other cloud data warehouses, because it addresses two recurring needs in analytical pipelines: the separation between raw ingestion and analytical consumption, and the ability to reprocess or audit the data at each stage without touching the source systems. The medallion pattern separates the data flow into three progressively refined layers, conventionally named bronze, silver, and gold. The following description focuses on how the pattern is instantiated in the specific pipeline that feeds data from ESSE3 into the reporting layer used in this project.</w:t>
+      </w:r>
+    </w:p>
+    <w:p>
+      <w:pPr>
+        <w:pStyle w:val="Heading3"/>
+      </w:pPr>
+      <w:r>
+        <w:t xml:space="preserve">5.2.1 End-to-end flow</w:t>
+      </w:r>
+    </w:p>
+    <w:p>
+      <w:r>
+        <w:t xml:space="preserve">The pipeline moves data from the ESSE3 Oracle database into the Snowflake analytical platform through three sequential phases: an extraction phase carried out on an on-premise virtual machine, a bronze loading phase orchestrated within Snowflake, and a silver refinement phase implemented through stored procedures. The three phases are chained by a signalling mechanism designed around a fail-fast principle: if any phase does not complete correctly, the subsequent phases do not start, and the analytical layer keeps the data of the previous day rather than exposing partially updated information. The end-to-end flow is illustrated in Figure 2.</w:t>
+      </w:r>
+    </w:p>
+    <w:p>
+      <w:pPr>
+        <w:spacing w:after="40" w:before="160"/>
+        <w:jc w:val="center"/>
+      </w:pPr>
+      <w:r>
+        <w:drawing>
+          <wp:inline distT="0" distB="0" distL="0" distR="0">
+            <wp:extent cx="5191125" cy="6477000"/>
+            <wp:effectExtent t="0" r="0" b="0" l="0"/>
+            <wp:docPr id="1" name="" descr="" title=""/>
+            <wp:cNvGraphicFramePr>
+              <a:graphicFrameLocks xmlns:a="http://schemas.openxmlformats.org/drawingml/2006/main" noChangeAspect="1"/>
+            </wp:cNvGraphicFramePr>
+            <a:graphic xmlns:a="http://schemas.openxmlformats.org/drawingml/2006/main">
+              <a:graphicData uri="http://schemas.openxmlformats.org/drawingml/2006/picture">
+                <pic:pic xmlns:pic="http://schemas.openxmlformats.org/drawingml/2006/picture">
+                  <pic:nvPicPr>
+                    <pic:cNvPr id="0" name="" descr=""/>
+                    <pic:cNvPicPr>
+                      <a:picLocks noChangeAspect="1" noChangeArrowheads="1"/>
+                    </pic:cNvPicPr>
+                  </pic:nvPicPr>
+                  <pic:blipFill>
+                    <a:blip r:embed="rId10" cstate="none"/>
+                    <a:srcRect/>
+                    <a:stretch>
+                      <a:fillRect/>
+                    </a:stretch>
+                  </pic:blipFill>
+                  <pic:spPr bwMode="auto">
+                    <a:xfrm>
+                      <a:off x="0" y="0"/>
+                      <a:ext cx="5191125" cy="6477000"/>
+                    </a:xfrm>
+                    <a:prstGeom prst="rect">
+                      <a:avLst/>
+                    </a:prstGeom>
+                  </pic:spPr>
+                </pic:pic>
+              </a:graphicData>
+            </a:graphic>
+          </wp:inline>
+        </w:drawing>
+      </w:r>
+    </w:p>
+    <w:p>
+      <w:pPr>
+        <w:spacing w:after="220"/>
+        <w:jc w:val="center"/>
+      </w:pPr>
       <w:r>
         <w:rPr>
           <w:i/>
           <w:iCs/>
-        </w:rPr>
-        <w:t xml:space="preserve">stage upload</w:t>
-      </w:r>
-      <w:r>
-        <w:t xml:space="preserve">: the text files produced by the spool are transferred to a Snowflake stage located in the landing area of the bronze database. The upload only runs if the spool has completed successfully.</w:t>
-      </w:r>
-    </w:p>
-    <w:p>
-      <w:r>
-        <w:t xml:space="preserve">The third step is the </w:t>
+          <w:sz w:val="20"/>
+          <w:szCs w:val="20"/>
+        </w:rPr>
+        <w:t xml:space="preserve">Figure 2. The end-to-end nightly pipeline, from extraction on the on-premise virtual machine through the bronze, silver, and gold layers in Snowflake, with the fail-fast checkpoints.</w:t>
+      </w:r>
+    </w:p>
+    <w:p>
+      <w:pPr>
+        <w:pStyle w:val="Heading3"/>
+      </w:pPr>
+      <w:r>
+        <w:t xml:space="preserve">5.2.2 Extraction from ESSE3 to the Snowflake stage</w:t>
+      </w:r>
+    </w:p>
+    <w:p>
+      <w:r>
+        <w:t xml:space="preserve">The extraction phase runs each night, orchestrated by a bash script executed on an on-premise virtual machine. The script coordinates three sequential steps.</w:t>
+      </w:r>
+    </w:p>
+    <w:p>
+      <w:r>
+        <w:t xml:space="preserve">The first step is the </w:t>
       </w:r>
       <w:r>
         <w:rPr>
           <w:i/>
           <w:iCs/>
         </w:rPr>
+        <w:t xml:space="preserve">spool</w:t>
+      </w:r>
+      <w:r>
+        <w:t xml:space="preserve">: a delimited text file is produced for each source table, driven by a per-table configuration file that specifies the extraction query. If any single table fails to spool, the step as a whole is marked as failed and the pipeline stops.</w:t>
+      </w:r>
+    </w:p>
+    <w:p>
+      <w:r>
+        <w:t xml:space="preserve">The second step is the </w:t>
+      </w:r>
+      <w:r>
+        <w:rPr>
+          <w:i/>
+          <w:iCs/>
+        </w:rPr>
+        <w:t xml:space="preserve">stage upload</w:t>
+      </w:r>
+      <w:r>
+        <w:t xml:space="preserve">: the text files produced by the spool are transferred to a Snowflake stage located in the landing area of the bronze database. The upload only runs if the spool has completed successfully.</w:t>
+      </w:r>
+    </w:p>
+    <w:p>
+      <w:r>
+        <w:t xml:space="preserve">The third step is the </w:t>
+      </w:r>
+      <w:r>
+        <w:rPr>
+          <w:i/>
+          <w:iCs/>
+        </w:rPr>
         <w:t xml:space="preserve">semaphore</w:t>
       </w:r>
       <w:r>
@@ -1337,7 +1459,7 @@
     </w:p>
     <w:p>
       <w:r>
-        <w:t xml:space="preserve">The semantic model described in Section 5.3 exposes to the reporting layer the entities and the relationships of the student careers domain. The KPIs discussed in this section are the DAX measures defined on top of that model. They translate the operational questions of academic management into calculations that Power BI evaluates in the context of the filters selected by the user of the dashboard. The measures documented in this section were designed and implemented by the author together with the semantic model on which they operate, within the framework and the naming conventions defined by the KPMG delivery team.</w:t>
+        <w:t xml:space="preserve">The semantic model described in Section 5.3 exposes to the reporting layer the entities and the relationships of the student careers domain. The KPIs discussed in this section are, for the most part, the DAX measures defined on top of that model, together with a small number of classifications computed in the gold layer and exposed through it. They translate the operational questions of academic management into calculations that Power BI evaluates in the context of the filters selected by the user of the dashboard. The measures documented in this section were designed and implemented by the author together with the semantic model on which they operate, within the framework and the naming conventions defined by the KPMG delivery team.</w:t>
       </w:r>
     </w:p>
     <w:p>
@@ -3408,7 +3530,7 @@
     </w:p>
     <w:p>
       <w:r>
-        <w:t xml:space="preserve">Five KPIs from families 1, 2, and 3 are discussed in detail below. They were selected because they illustrate design choices representative of the catalogue as a whole: filter encapsulation, denominator alignment, use of relationships for cross-fact computations, delegation of categorical logic to dimensions, and encoding of business rules as measures.</w:t>
+        <w:t xml:space="preserve">Five KPIs from families 1, 2, and 3 are discussed in detail below. They were selected because they illustrate design choices representative of the catalogue as a whole: filter encapsulation, denominator alignment, use of relationships for cross-fact computations, delegation of categorical logic to dimensions, and the encoding of business rules in the model.</w:t>
       </w:r>
     </w:p>
     <w:p>
@@ -3549,204 +3671,786 @@
         <w:t xml:space="preserve">Fascia Studente CdS.</w:t>
       </w:r>
       <w:r>
-        <w:t xml:space="preserve"> The student risk band per programme is the most complex measure of the catalogue, and the one that best illustrates the value of a governed semantic model for management reporting. It is defined directly on the presenze fact table, in accordance with the hybrid approach described in Section 5.4.1: its logic is tightly coupled to the attendance data and its grain matches that of the fact. Its purpose is to classify each student, within a given study programme and academic year, into one of three risk bands (labelled with a green, yellow, or red traffic-light convention) based on the student's absence rate: below 11%, between 11% and 22%, and above 22%. The measure is defined at the grain of student × study programme × academic year, and it computes for each such triple the ratio between total absences and total lectures, then assigns the band using a </w:t>
-      </w:r>
-      <w:r>
-        <w:rPr>
-          <w:rFonts w:ascii="Consolas" w:cs="Consolas" w:eastAsia="Consolas" w:hAnsi="Consolas"/>
-        </w:rPr>
-        <w:t xml:space="preserve">SWITCH</w:t>
-      </w:r>
-      <w:r>
-        <w:t xml:space="preserve"> expression on the ratio. Three design choices are worth commenting.</w:t>
-      </w:r>
-    </w:p>
-    <w:p>
-      <w:r>
-        <w:t xml:space="preserve">The first is the explicit computation of the grain inside the measure. Because the calculation must be performed per student per programme per year regardless of the filter context, the measure uses variables (</w:t>
-      </w:r>
-      <w:r>
-        <w:rPr>
-          <w:rFonts w:ascii="Consolas" w:cs="Consolas" w:eastAsia="Consolas" w:hAnsi="Consolas"/>
-        </w:rPr>
-        <w:t xml:space="preserve">VAR</w:t>
-      </w:r>
-      <w:r>
-        <w:t xml:space="preserve">) to capture the values of the three grain attributes at the current row and then applies a </w:t>
-      </w:r>
-      <w:r>
-        <w:rPr>
-          <w:rFonts w:ascii="Consolas" w:cs="Consolas" w:eastAsia="Consolas" w:hAnsi="Consolas"/>
-        </w:rPr>
-        <w:t xml:space="preserve">CALCULATE</w:t>
-      </w:r>
-      <w:r>
-        <w:t xml:space="preserve"> with an explicit </w:t>
-      </w:r>
-      <w:r>
-        <w:rPr>
-          <w:rFonts w:ascii="Consolas" w:cs="Consolas" w:eastAsia="Consolas" w:hAnsi="Consolas"/>
-        </w:rPr>
-        <w:t xml:space="preserve">FILTER</w:t>
-      </w:r>
-      <w:r>
-        <w:t xml:space="preserve"> that restricts the calculation to that same triple. This ensures that the categorisation of a student is stable across dashboard filters that change the visible level of aggregation.</w:t>
-      </w:r>
-    </w:p>
-    <w:p>
-      <w:r>
-        <w:t xml:space="preserve">The second is the encoding of a business rule as a data-model object. The thresholds of 11% and 22% and the traffic-light labels are policies of the academic management of the university, not of the reporting tool. Their inclusion in the measure means that every dashboard displaying a fascia value uses the same thresholds, and that a change in the policy (for example, a shift of the yellow-red threshold from 22% to 20%) is applied by editing one measure rather than by hunting for the definition across multiple reports.</w:t>
-      </w:r>
-    </w:p>
-    <w:p>
-      <w:r>
-        <w:t xml:space="preserve">The third is the handling of the empty case. When a student has zero recorded lectures for a given programme and year, the ratio would be undefined and the traffic-light categorisation would be misleading. The measure returns the explicit label "N/D" in this case, which surfaces the incomplete data in the report rather than collapsing it into a colour band.</w:t>
-      </w:r>
-    </w:p>
-    <w:p>
-      <w:pPr>
-        <w:pStyle w:val="Heading3"/>
-      </w:pPr>
-      <w:r>
-        <w:t xml:space="preserve">5.4.4 Design patterns across the catalogue</w:t>
-      </w:r>
-    </w:p>
-    <w:p>
-      <w:r>
-        <w:t xml:space="preserve">The KPIs described in Section 5.4.3 illustrate a small set of design patterns that recur across the catalogue and follow from the choice to centralise the definitions in the semantic model rather than in the individual reports or in ad hoc queries.</w:t>
-      </w:r>
-    </w:p>
-    <w:p>
-      <w:r>
-        <w:t xml:space="preserve">The first pattern is the encapsulation of filter conditions inside the measure. Filters that identify the correct subset of records for a given KPI, such as the three filters of </w:t>
-      </w:r>
-      <w:r>
-        <w:rPr>
-          <w:rFonts w:ascii="Consolas" w:cs="Consolas" w:eastAsia="Consolas" w:hAnsi="Consolas"/>
-        </w:rPr>
-        <w:t xml:space="preserve">Media Ponderata</w:t>
-      </w:r>
-      <w:r>
-        <w:t xml:space="preserve">, are written once inside the measure and reused implicitly by every visual that consumes it. This removes a well-known class of error caused by re-implementing the same filters differently across queries.</w:t>
-      </w:r>
-    </w:p>
-    <w:p>
-      <w:r>
-        <w:t xml:space="preserve">The second pattern is the reuse of measures inside other measures. Several KPIs of the catalogue are defined by referring to a previously defined KPI as their building block: </w:t>
-      </w:r>
-      <w:r>
-        <w:rPr>
-          <w:rFonts w:ascii="Consolas" w:cs="Consolas" w:eastAsia="Consolas" w:hAnsi="Consolas"/>
-        </w:rPr>
-        <w:t xml:space="preserve"># Matricole</w:t>
-      </w:r>
-      <w:r>
-        <w:t xml:space="preserve"> refers to </w:t>
-      </w:r>
-      <w:r>
-        <w:rPr>
-          <w:rFonts w:ascii="Consolas" w:cs="Consolas" w:eastAsia="Consolas" w:hAnsi="Consolas"/>
-        </w:rPr>
-        <w:t xml:space="preserve"># Iscritti</w:t>
-      </w:r>
-      <w:r>
-        <w:t xml:space="preserve">, and the gender percentages are defined against </w:t>
-      </w:r>
-      <w:r>
-        <w:rPr>
-          <w:rFonts w:ascii="Consolas" w:cs="Consolas" w:eastAsia="Consolas" w:hAnsi="Consolas"/>
-        </w:rPr>
-        <w:t xml:space="preserve"># Iscritti</w:t>
-      </w:r>
-      <w:r>
-        <w:t xml:space="preserve">. This composition guarantees that a change to the base definition propagates to the derived KPIs consistently, and it makes the intent of the derived KPI explicit in its expression.</w:t>
-      </w:r>
-    </w:p>
-    <w:p>
-      <w:r>
-        <w:t xml:space="preserve">The third pattern is the delegation of categorical logic to calculated columns of the dimensions, illustrated by </w:t>
-      </w:r>
-      <w:r>
-        <w:rPr>
-          <w:rFonts w:ascii="Consolas" w:cs="Consolas" w:eastAsia="Consolas" w:hAnsi="Consolas"/>
-        </w:rPr>
-        <w:t xml:space="preserve">Studenti In corso</w:t>
-      </w:r>
-      <w:r>
-        <w:t xml:space="preserve"> / </w:t>
-      </w:r>
-      <w:r>
-        <w:rPr>
-          <w:rFonts w:ascii="Consolas" w:cs="Consolas" w:eastAsia="Consolas" w:hAnsi="Consolas"/>
-        </w:rPr>
-        <w:t xml:space="preserve">Studenti fuori corso</w:t>
-      </w:r>
-      <w:r>
-        <w:t xml:space="preserve">. When a categorisation is applied by many measures or visuals, defining it at the dimension level rather than at the measure level reduces the number of places at which it must be maintained.</w:t>
-      </w:r>
-    </w:p>
-    <w:p>
-      <w:r>
-        <w:t xml:space="preserve">Taken together, these patterns implement in the semantic model the governance principle discussed in Section 4.3 as the second limitation of the pre-existing reporting model: the same metric, asked at different moments or by different users, must return the same value.</w:t>
-      </w:r>
-    </w:p>
-    <w:p>
-      <w:pPr>
-        <w:pStyle w:val="Heading2"/>
-      </w:pPr>
-      <w:r>
-        <w:t xml:space="preserve">5.5 Power BI implementation</w:t>
-      </w:r>
-    </w:p>
-    <w:p>
-      <w:r>
-        <w:t xml:space="preserve">The semantic model and the KPIs described in Sections 5.3 and 5.4 are consumed by a set of Power BI reports that expose the analytical output of the project to academic management. This section describes how the reports are organised, how the interaction with the data is structured across pages, and how the reports are distributed to the users through Power BI Service.</w:t>
-      </w:r>
-    </w:p>
-    <w:p>
-      <w:pPr>
-        <w:pStyle w:val="Heading3"/>
-      </w:pPr>
-      <w:r>
-        <w:t xml:space="preserve">5.5.1 Report organisation</w:t>
-      </w:r>
-    </w:p>
-    <w:p>
-      <w:r>
-        <w:t xml:space="preserve">The Business Intelligence solution is not delivered as a single monolithic report. It is organised as a collection of thematic reports, each of which covers one KPI domain of the wider project: student careers and academic performance, student services, and the other domains mentioned in Section 4.5. This organisation was preferred over a single-report design for three reasons: it aligns the boundary of each report with a well-defined semantic model, it keeps the maintenance surface of each report contained, and it allows the differentiation of access rights across audiences to be applied at the level of the individual report rather than at the level of the pages of a shared one.</w:t>
-      </w:r>
-    </w:p>
-    <w:p>
-      <w:r>
-        <w:t xml:space="preserve">The report at the centre of this thesis, which corresponds to the student careers domain, is built on the semantic model documented in Section 5.3 and consumes the KPIs catalogued in Section 5.4. Its pages are organised around the thematic families of the KPI catalogue: pages dedicated to enrolment and population, pages dedicated to academic performance, and pages dedicated to attendance and risk monitoring. The pages that cover families beyond the direct focus of the thesis (didactic organisation, teaching staff, classrooms) are part of the same report but are not analysed in detail here, consistently with the scope delimitation stated in Section 4.5.</w:t>
-      </w:r>
-    </w:p>
-    <w:p>
-      <w:pPr>
-        <w:pStyle w:val="Heading3"/>
-      </w:pPr>
-      <w:r>
-        <w:t xml:space="preserve">5.5.2 Interaction patterns across pages</w:t>
-      </w:r>
-    </w:p>
-    <w:p>
-      <w:r>
-        <w:t xml:space="preserve">The pages of the report follow one of two complementary interaction patterns, depending on the nature of the management question they support.</w:t>
-      </w:r>
-    </w:p>
-    <w:p>
-      <w:r>
-        <w:t xml:space="preserve">The first pattern is the </w:t>
+        <w:t xml:space="preserve"> The student risk band is the most elaborate rule of the catalogue, and the one that best shows the value of pushing a business rule into the governed layer. It is not a DAX measure but a categorical attribute computed in the gold Dynamic Table </w:t>
+      </w:r>
+      <w:r>
+        <w:rPr>
+          <w:rFonts w:ascii="Consolas" w:cs="Consolas" w:eastAsia="Consolas" w:hAnsi="Consolas"/>
+        </w:rPr>
+        <w:t xml:space="preserve">TFCT_PRST_PRESENZE_STUDENTE</w:t>
+      </w:r>
+      <w:r>
+        <w:t xml:space="preserve">, at the grain of one row per student per didactic activity per study programme per academic year, and exposed to the semantic model as a column. For each row it takes the ratio between the student's absences and the maximum programmed hours of the activity and assigns one of four bands: green up to 11%, yellow up to 22%, red up to 33%, and black above 33%. When the data is not sufficient for the classification to mean anything, the row is labelled "N/D" rather than forced into a band; this happens when the student has two recorded lectures or fewer, or when the maximum programmed hours of the activity are missing or zero. The same logic is computed a second time at the coarser grain of the study programme, where the absences are compared against an absence budget aggregated across the activities of the programme, so that a report can show a band both per activity and per programme. Three design choices are worth commenting.</w:t>
+      </w:r>
+    </w:p>
+    <w:p>
+      <w:r>
+        <w:t xml:space="preserve">The first is that the rule lives in the gold layer rather than in a report. The thresholds of 11%, 22%, and 33%, the four band labels, and the related rules (a non-admission flag raised when the absence rate exceeds 33% for an activity with mandatory attendance, and a below-threshold flag raised when the presence rate falls under the required percentage) are computed once, in the definition of the fact table. Every report that shows a band reads the same value, and a change in the policy is applied by editing one table rather than several reports.</w:t>
+      </w:r>
+    </w:p>
+    <w:p>
+      <w:r>
+        <w:t xml:space="preserve">The second is the explicit handling of the denominator and of the missing dimension. The ratio is guarded so that a zero or missing number of hours produces an "N/D" label rather than an error or a misleading band, and a fact row whose study programme cannot be matched is attached to a ghost record rather than dropped. These are the safeguards described in Section 5.3.4, visible here in one definition.</w:t>
+      </w:r>
+    </w:p>
+    <w:p>
+      <w:r>
+        <w:t xml:space="preserve">The third is that the classification is stable across the filters of the dashboard. Because the band is materialised at a defined grain in the gold layer, its value for a given student, activity, programme, and year does not change when the user changes the level of aggregation shown on the page; the report aggregates or counts the pre-computed bands rather than recomputing them in a way that could depend on the visible context. Listing 1 shows a simplified extract of the rule, with the personal attributes of the student removed.</w:t>
+      </w:r>
+    </w:p>
+    <w:p>
+      <w:pPr>
+        <w:shd w:fill="F5F5F5" w:val="clear"/>
+        <w:spacing w:after="0" w:line="240" w:lineRule="auto"/>
+        <w:ind w:left="200"/>
+        <w:jc w:val="left"/>
+      </w:pPr>
+      <w:r>
+        <w:rPr>
+          <w:rFonts w:ascii="Consolas" w:cs="Consolas" w:eastAsia="Consolas" w:hAnsi="Consolas"/>
+          <w:sz w:val="17"/>
+          <w:szCs w:val="17"/>
+        </w:rPr>
+        <w:t xml:space="preserve">CREATE OR REPLACE DYNAMIC TABLE TFCT_PRST_PRESENZE_STUDENTE</w:t>
+      </w:r>
+    </w:p>
+    <w:p>
+      <w:pPr>
+        <w:shd w:fill="F5F5F5" w:val="clear"/>
+        <w:spacing w:after="0" w:line="240" w:lineRule="auto"/>
+        <w:ind w:left="200"/>
+        <w:jc w:val="left"/>
+      </w:pPr>
+      <w:r>
+        <w:rPr>
+          <w:rFonts w:ascii="Consolas" w:cs="Consolas" w:eastAsia="Consolas" w:hAnsi="Consolas"/>
+          <w:sz w:val="17"/>
+          <w:szCs w:val="17"/>
+        </w:rPr>
+        <w:t xml:space="preserve">  TARGET_LAG = '1 day', WAREHOUSE = WH_ELT_XS_DEV, REFRESH_MODE = AUTO</w:t>
+      </w:r>
+    </w:p>
+    <w:p>
+      <w:pPr>
+        <w:shd w:fill="F5F5F5" w:val="clear"/>
+        <w:spacing w:after="0" w:line="240" w:lineRule="auto"/>
+        <w:ind w:left="200"/>
+        <w:jc w:val="left"/>
+      </w:pPr>
+      <w:r>
+        <w:rPr>
+          <w:rFonts w:ascii="Consolas" w:cs="Consolas" w:eastAsia="Consolas" w:hAnsi="Consolas"/>
+          <w:sz w:val="17"/>
+          <w:szCs w:val="17"/>
+        </w:rPr>
+        <w:t xml:space="preserve">AS</w:t>
+      </w:r>
+    </w:p>
+    <w:p>
+      <w:pPr>
+        <w:shd w:fill="F5F5F5" w:val="clear"/>
+        <w:spacing w:after="0" w:line="240" w:lineRule="auto"/>
+        <w:ind w:left="200"/>
+        <w:jc w:val="left"/>
+      </w:pPr>
+      <w:r>
+        <w:rPr>
+          <w:rFonts w:ascii="Consolas" w:cs="Consolas" w:eastAsia="Consolas" w:hAnsi="Consolas"/>
+          <w:sz w:val="17"/>
+          <w:szCs w:val="17"/>
+        </w:rPr>
+        <w:t xml:space="preserve">WITH stats_studente AS (            -- per student x activity x programme x year</w:t>
+      </w:r>
+    </w:p>
+    <w:p>
+      <w:pPr>
+        <w:shd w:fill="F5F5F5" w:val="clear"/>
+        <w:spacing w:after="0" w:line="240" w:lineRule="auto"/>
+        <w:ind w:left="200"/>
+        <w:jc w:val="left"/>
+      </w:pPr>
+      <w:r>
+        <w:rPr>
+          <w:rFonts w:ascii="Consolas" w:cs="Consolas" w:eastAsia="Consolas" w:hAnsi="Consolas"/>
+          <w:sz w:val="17"/>
+          <w:szCs w:val="17"/>
+        </w:rPr>
+        <w:t xml:space="preserve">  SELECT PRES_ID_STU_ID, ELEN_ID_AD_ID, ELEN_ID_CDS_ID, ELEN_NR_AA_OFF_ID,</w:t>
+      </w:r>
+    </w:p>
+    <w:p>
+      <w:pPr>
+        <w:shd w:fill="F5F5F5" w:val="clear"/>
+        <w:spacing w:after="0" w:line="240" w:lineRule="auto"/>
+        <w:ind w:left="200"/>
+        <w:jc w:val="left"/>
+      </w:pPr>
+      <w:r>
+        <w:rPr>
+          <w:rFonts w:ascii="Consolas" w:cs="Consolas" w:eastAsia="Consolas" w:hAnsi="Consolas"/>
+          <w:sz w:val="17"/>
+          <w:szCs w:val="17"/>
+        </w:rPr>
+        <w:t xml:space="preserve">         COUNT(*) AS NR_LEZIONI_TOTALI,</w:t>
+      </w:r>
+    </w:p>
+    <w:p>
+      <w:pPr>
+        <w:shd w:fill="F5F5F5" w:val="clear"/>
+        <w:spacing w:after="0" w:line="240" w:lineRule="auto"/>
+        <w:ind w:left="200"/>
+        <w:jc w:val="left"/>
+      </w:pPr>
+      <w:r>
+        <w:rPr>
+          <w:rFonts w:ascii="Consolas" w:cs="Consolas" w:eastAsia="Consolas" w:hAnsi="Consolas"/>
+          <w:sz w:val="17"/>
+          <w:szCs w:val="17"/>
+        </w:rPr>
+        <w:t xml:space="preserve">         COUNT(CASE WHEN PRES_CD_PRESENZA = 'FALSE' THEN 1 END) AS NR_ASSENZE</w:t>
+      </w:r>
+    </w:p>
+    <w:p>
+      <w:pPr>
+        <w:shd w:fill="F5F5F5" w:val="clear"/>
+        <w:spacing w:after="0" w:line="240" w:lineRule="auto"/>
+        <w:ind w:left="200"/>
+        <w:jc w:val="left"/>
+      </w:pPr>
+      <w:r>
+        <w:rPr>
+          <w:rFonts w:ascii="Consolas" w:cs="Consolas" w:eastAsia="Consolas" w:hAnsi="Consolas"/>
+          <w:sz w:val="17"/>
+          <w:szCs w:val="17"/>
+        </w:rPr>
+        <w:t xml:space="preserve">  FROM ...                          -- silver attendance joined to lecture context</w:t>
+      </w:r>
+    </w:p>
+    <w:p>
+      <w:pPr>
+        <w:shd w:fill="F5F5F5" w:val="clear"/>
+        <w:spacing w:after="0" w:line="240" w:lineRule="auto"/>
+        <w:ind w:left="200"/>
+        <w:jc w:val="left"/>
+      </w:pPr>
+      <w:r>
+        <w:rPr>
+          <w:rFonts w:ascii="Consolas" w:cs="Consolas" w:eastAsia="Consolas" w:hAnsi="Consolas"/>
+          <w:sz w:val="17"/>
+          <w:szCs w:val="17"/>
+        </w:rPr>
+        <w:t xml:space="preserve">  GROUP BY 1, 2, 3, 4</w:t>
+      </w:r>
+    </w:p>
+    <w:p>
+      <w:pPr>
+        <w:shd w:fill="F5F5F5" w:val="clear"/>
+        <w:spacing w:after="0" w:line="240" w:lineRule="auto"/>
+        <w:ind w:left="200"/>
+        <w:jc w:val="left"/>
+      </w:pPr>
+      <w:r>
+        <w:rPr>
+          <w:rFonts w:ascii="Consolas" w:cs="Consolas" w:eastAsia="Consolas" w:hAnsi="Consolas"/>
+          <w:sz w:val="17"/>
+          <w:szCs w:val="17"/>
+        </w:rPr>
+        <w:t xml:space="preserve">)</w:t>
+      </w:r>
+    </w:p>
+    <w:p>
+      <w:pPr>
+        <w:shd w:fill="F5F5F5" w:val="clear"/>
+        <w:spacing w:after="0" w:line="240" w:lineRule="auto"/>
+        <w:ind w:left="200"/>
+        <w:jc w:val="left"/>
+      </w:pPr>
+      <w:r>
+        <w:rPr>
+          <w:rFonts w:ascii="Consolas" w:cs="Consolas" w:eastAsia="Consolas" w:hAnsi="Consolas"/>
+          <w:sz w:val="17"/>
+          <w:szCs w:val="17"/>
+        </w:rPr>
+        <w:t xml:space="preserve">SELECT</w:t>
+      </w:r>
+    </w:p>
+    <w:p>
+      <w:pPr>
+        <w:shd w:fill="F5F5F5" w:val="clear"/>
+        <w:spacing w:after="0" w:line="240" w:lineRule="auto"/>
+        <w:ind w:left="200"/>
+        <w:jc w:val="left"/>
+      </w:pPr>
+      <w:r>
+        <w:rPr>
+          <w:rFonts w:ascii="Consolas" w:cs="Consolas" w:eastAsia="Consolas" w:hAnsi="Consolas"/>
+          <w:sz w:val="17"/>
+          <w:szCs w:val="17"/>
+        </w:rPr>
+        <w:t xml:space="preserve">  COALESCE(dcds.COST_HK, MD5_BINARY('GHOST_RECORD')) AS FK_COST_HK,</w:t>
+      </w:r>
+    </w:p>
+    <w:p>
+      <w:pPr>
+        <w:shd w:fill="F5F5F5" w:val="clear"/>
+        <w:spacing w:after="0" w:line="240" w:lineRule="auto"/>
+        <w:ind w:left="200"/>
+        <w:jc w:val="left"/>
+      </w:pPr>
+      <w:r>
+        <w:rPr>
+          <w:rFonts w:ascii="Consolas" w:cs="Consolas" w:eastAsia="Consolas" w:hAnsi="Consolas"/>
+          <w:sz w:val="17"/>
+          <w:szCs w:val="17"/>
+        </w:rPr>
+        <w:t xml:space="preserve">  ROUND(st.NR_ASSENZE / NULLIF(st.NR_LEZIONI_TOTALI, 0), 4) AS PRST_PR_ASSENZE,</w:t>
+      </w:r>
+    </w:p>
+    <w:p>
+      <w:pPr>
+        <w:shd w:fill="F5F5F5" w:val="clear"/>
+        <w:spacing w:after="0" w:line="240" w:lineRule="auto"/>
+        <w:ind w:left="200"/>
+        <w:jc w:val="left"/>
+      </w:pPr>
+      <w:r>
+        <w:rPr>
+          <w:rFonts w:ascii="Consolas" w:cs="Consolas" w:eastAsia="Consolas" w:hAnsi="Consolas"/>
+          <w:sz w:val="17"/>
+          <w:szCs w:val="17"/>
+        </w:rPr>
+        <w:t xml:space="preserve">  CASE</w:t>
+      </w:r>
+    </w:p>
+    <w:p>
+      <w:pPr>
+        <w:shd w:fill="F5F5F5" w:val="clear"/>
+        <w:spacing w:after="0" w:line="240" w:lineRule="auto"/>
+        <w:ind w:left="200"/>
+        <w:jc w:val="left"/>
+      </w:pPr>
+      <w:r>
+        <w:rPr>
+          <w:rFonts w:ascii="Consolas" w:cs="Consolas" w:eastAsia="Consolas" w:hAnsi="Consolas"/>
+          <w:sz w:val="17"/>
+          <w:szCs w:val="17"/>
+        </w:rPr>
+        <w:t xml:space="preserve">    WHEN st.NR_LEZIONI_TOTALI &lt;= 2</w:t>
+      </w:r>
+    </w:p>
+    <w:p>
+      <w:pPr>
+        <w:shd w:fill="F5F5F5" w:val="clear"/>
+        <w:spacing w:after="0" w:line="240" w:lineRule="auto"/>
+        <w:ind w:left="200"/>
+        <w:jc w:val="left"/>
+      </w:pPr>
+      <w:r>
+        <w:rPr>
+          <w:rFonts w:ascii="Consolas" w:cs="Consolas" w:eastAsia="Consolas" w:hAnsi="Consolas"/>
+          <w:sz w:val="17"/>
+          <w:szCs w:val="17"/>
+        </w:rPr>
+        <w:t xml:space="preserve">      OR omax.ORE_MAX IS NULL OR omax.ORE_MAX = 0   THEN 'N/D'</w:t>
+      </w:r>
+    </w:p>
+    <w:p>
+      <w:pPr>
+        <w:shd w:fill="F5F5F5" w:val="clear"/>
+        <w:spacing w:after="0" w:line="240" w:lineRule="auto"/>
+        <w:ind w:left="200"/>
+        <w:jc w:val="left"/>
+      </w:pPr>
+      <w:r>
+        <w:rPr>
+          <w:rFonts w:ascii="Consolas" w:cs="Consolas" w:eastAsia="Consolas" w:hAnsi="Consolas"/>
+          <w:sz w:val="17"/>
+          <w:szCs w:val="17"/>
+        </w:rPr>
+        <w:t xml:space="preserve">    WHEN st.NR_ASSENZE / omax.ORE_MAX &lt;= 0.11        THEN 'VERDE'</w:t>
+      </w:r>
+    </w:p>
+    <w:p>
+      <w:pPr>
+        <w:shd w:fill="F5F5F5" w:val="clear"/>
+        <w:spacing w:after="0" w:line="240" w:lineRule="auto"/>
+        <w:ind w:left="200"/>
+        <w:jc w:val="left"/>
+      </w:pPr>
+      <w:r>
+        <w:rPr>
+          <w:rFonts w:ascii="Consolas" w:cs="Consolas" w:eastAsia="Consolas" w:hAnsi="Consolas"/>
+          <w:sz w:val="17"/>
+          <w:szCs w:val="17"/>
+        </w:rPr>
+        <w:t xml:space="preserve">    WHEN st.NR_ASSENZE / omax.ORE_MAX &lt;= 0.22        THEN 'GIALLO'</w:t>
+      </w:r>
+    </w:p>
+    <w:p>
+      <w:pPr>
+        <w:shd w:fill="F5F5F5" w:val="clear"/>
+        <w:spacing w:after="0" w:line="240" w:lineRule="auto"/>
+        <w:ind w:left="200"/>
+        <w:jc w:val="left"/>
+      </w:pPr>
+      <w:r>
+        <w:rPr>
+          <w:rFonts w:ascii="Consolas" w:cs="Consolas" w:eastAsia="Consolas" w:hAnsi="Consolas"/>
+          <w:sz w:val="17"/>
+          <w:szCs w:val="17"/>
+        </w:rPr>
+        <w:t xml:space="preserve">    WHEN st.NR_ASSENZE / omax.ORE_MAX &lt;= 0.33        THEN 'ROSSO'</w:t>
+      </w:r>
+    </w:p>
+    <w:p>
+      <w:pPr>
+        <w:shd w:fill="F5F5F5" w:val="clear"/>
+        <w:spacing w:after="0" w:line="240" w:lineRule="auto"/>
+        <w:ind w:left="200"/>
+        <w:jc w:val="left"/>
+      </w:pPr>
+      <w:r>
+        <w:rPr>
+          <w:rFonts w:ascii="Consolas" w:cs="Consolas" w:eastAsia="Consolas" w:hAnsi="Consolas"/>
+          <w:sz w:val="17"/>
+          <w:szCs w:val="17"/>
+        </w:rPr>
+        <w:t xml:space="preserve">    ELSE 'NERO'</w:t>
+      </w:r>
+    </w:p>
+    <w:p>
+      <w:pPr>
+        <w:shd w:fill="F5F5F5" w:val="clear"/>
+        <w:spacing w:after="0" w:line="240" w:lineRule="auto"/>
+        <w:ind w:left="200"/>
+        <w:jc w:val="left"/>
+      </w:pPr>
+      <w:r>
+        <w:rPr>
+          <w:rFonts w:ascii="Consolas" w:cs="Consolas" w:eastAsia="Consolas" w:hAnsi="Consolas"/>
+          <w:sz w:val="17"/>
+          <w:szCs w:val="17"/>
+        </w:rPr>
+        <w:t xml:space="preserve">  END AS PRST_CD_FASCIA_RISCHIO</w:t>
+      </w:r>
+    </w:p>
+    <w:p>
+      <w:pPr>
+        <w:shd w:fill="F5F5F5" w:val="clear"/>
+        <w:spacing w:after="0" w:line="240" w:lineRule="auto"/>
+        <w:ind w:left="200"/>
+        <w:jc w:val="left"/>
+      </w:pPr>
+      <w:r>
+        <w:rPr>
+          <w:rFonts w:ascii="Consolas" w:cs="Consolas" w:eastAsia="Consolas" w:hAnsi="Consolas"/>
+          <w:sz w:val="17"/>
+          <w:szCs w:val="17"/>
+        </w:rPr>
+        <w:t xml:space="preserve">FROM stats_studente st</w:t>
+      </w:r>
+    </w:p>
+    <w:p>
+      <w:pPr>
+        <w:shd w:fill="F5F5F5" w:val="clear"/>
+        <w:spacing w:after="0" w:line="240" w:lineRule="auto"/>
+        <w:ind w:left="200"/>
+        <w:jc w:val="left"/>
+      </w:pPr>
+      <w:r>
+        <w:rPr>
+          <w:rFonts w:ascii="Consolas" w:cs="Consolas" w:eastAsia="Consolas" w:hAnsi="Consolas"/>
+          <w:sz w:val="17"/>
+          <w:szCs w:val="17"/>
+        </w:rPr>
+        <w:t xml:space="preserve">LEFT JOIN dim_corso dcds ON dcds.COST_ID_CDS_ID = st.ELEN_ID_CDS_ID</w:t>
+      </w:r>
+    </w:p>
+    <w:p>
+      <w:pPr>
+        <w:shd w:fill="F5F5F5" w:val="clear"/>
+        <w:spacing w:after="0" w:line="240" w:lineRule="auto"/>
+        <w:ind w:left="200"/>
+        <w:jc w:val="left"/>
+      </w:pPr>
+      <w:r>
+        <w:rPr>
+          <w:rFonts w:ascii="Consolas" w:cs="Consolas" w:eastAsia="Consolas" w:hAnsi="Consolas"/>
+          <w:sz w:val="17"/>
+          <w:szCs w:val="17"/>
+        </w:rPr>
+        <w:t xml:space="preserve">LEFT JOIN ore_max   omax ON omax.AD_GEN_ID = st.ELEN_ID_AD_ID</w:t>
+      </w:r>
+    </w:p>
+    <w:p>
+      <w:pPr>
+        <w:shd w:fill="F5F5F5" w:val="clear"/>
+        <w:spacing w:after="0" w:line="240" w:lineRule="auto"/>
+        <w:ind w:left="200"/>
+        <w:jc w:val="left"/>
+      </w:pPr>
+      <w:r>
+        <w:rPr>
+          <w:rFonts w:ascii="Consolas" w:cs="Consolas" w:eastAsia="Consolas" w:hAnsi="Consolas"/>
+          <w:sz w:val="17"/>
+          <w:szCs w:val="17"/>
+        </w:rPr>
+        <w:t xml:space="preserve">                        AND omax.ADMO_NR_AA_OFF_ID = st.ELEN_NR_AA_OFF_ID;</w:t>
+      </w:r>
+    </w:p>
+    <w:p>
+      <w:pPr>
+        <w:spacing w:after="80"/>
+      </w:pPr>
+    </w:p>
+    <w:p>
+      <w:r>
+        <w:rPr>
+          <w:b/>
+          <w:bCs/>
+        </w:rPr>
+        <w:t xml:space="preserve">Listing 1</w:t>
+      </w:r>
+      <w:r>
+        <w:t xml:space="preserve"> — </w:t>
       </w:r>
       <w:r>
         <w:rPr>
           <w:i/>
           <w:iCs/>
         </w:rPr>
+        <w:t xml:space="preserve">Simplified extract of the risk-band logic in the gold layer, with the student's personal attributes omitted.</w:t>
+      </w:r>
+    </w:p>
+    <w:p>
+      <w:pPr>
+        <w:pStyle w:val="Heading3"/>
+      </w:pPr>
+      <w:r>
+        <w:t xml:space="preserve">5.4.4 Design patterns across the catalogue</w:t>
+      </w:r>
+    </w:p>
+    <w:p>
+      <w:r>
+        <w:t xml:space="preserve">The KPIs described in Section 5.4.3 illustrate a small set of design patterns that recur across the catalogue and follow from the choice to centralise the definitions in the semantic model rather than in the individual reports or in ad hoc queries.</w:t>
+      </w:r>
+    </w:p>
+    <w:p>
+      <w:r>
+        <w:t xml:space="preserve">The first pattern is the encapsulation of filter conditions inside the measure. Filters that identify the correct subset of records for a given KPI, such as the three filters of </w:t>
+      </w:r>
+      <w:r>
+        <w:rPr>
+          <w:rFonts w:ascii="Consolas" w:cs="Consolas" w:eastAsia="Consolas" w:hAnsi="Consolas"/>
+        </w:rPr>
+        <w:t xml:space="preserve">Media Ponderata</w:t>
+      </w:r>
+      <w:r>
+        <w:t xml:space="preserve">, are written once inside the measure and reused implicitly by every visual that consumes it. This removes a well-known class of error caused by re-implementing the same filters differently across queries.</w:t>
+      </w:r>
+    </w:p>
+    <w:p>
+      <w:r>
+        <w:t xml:space="preserve">The second pattern is the reuse of measures inside other measures. Several KPIs of the catalogue are defined by referring to a previously defined KPI as their building block: </w:t>
+      </w:r>
+      <w:r>
+        <w:rPr>
+          <w:rFonts w:ascii="Consolas" w:cs="Consolas" w:eastAsia="Consolas" w:hAnsi="Consolas"/>
+        </w:rPr>
+        <w:t xml:space="preserve"># Matricole</w:t>
+      </w:r>
+      <w:r>
+        <w:t xml:space="preserve"> refers to </w:t>
+      </w:r>
+      <w:r>
+        <w:rPr>
+          <w:rFonts w:ascii="Consolas" w:cs="Consolas" w:eastAsia="Consolas" w:hAnsi="Consolas"/>
+        </w:rPr>
+        <w:t xml:space="preserve"># Iscritti</w:t>
+      </w:r>
+      <w:r>
+        <w:t xml:space="preserve">, and the gender percentages are defined against </w:t>
+      </w:r>
+      <w:r>
+        <w:rPr>
+          <w:rFonts w:ascii="Consolas" w:cs="Consolas" w:eastAsia="Consolas" w:hAnsi="Consolas"/>
+        </w:rPr>
+        <w:t xml:space="preserve"># Iscritti</w:t>
+      </w:r>
+      <w:r>
+        <w:t xml:space="preserve">. This composition guarantees that a change to the base definition propagates to the derived KPIs consistently, and it makes the intent of the derived KPI explicit in its expression.</w:t>
+      </w:r>
+    </w:p>
+    <w:p>
+      <w:r>
+        <w:t xml:space="preserve">The third pattern is the delegation of categorical logic to calculated columns of the dimensions, illustrated by </w:t>
+      </w:r>
+      <w:r>
+        <w:rPr>
+          <w:rFonts w:ascii="Consolas" w:cs="Consolas" w:eastAsia="Consolas" w:hAnsi="Consolas"/>
+        </w:rPr>
+        <w:t xml:space="preserve">Studenti In corso</w:t>
+      </w:r>
+      <w:r>
+        <w:t xml:space="preserve"> / </w:t>
+      </w:r>
+      <w:r>
+        <w:rPr>
+          <w:rFonts w:ascii="Consolas" w:cs="Consolas" w:eastAsia="Consolas" w:hAnsi="Consolas"/>
+        </w:rPr>
+        <w:t xml:space="preserve">Studenti fuori corso</w:t>
+      </w:r>
+      <w:r>
+        <w:t xml:space="preserve">. When a categorisation is applied by many measures or visuals, defining it at the dimension level rather than at the measure level reduces the number of places at which it must be maintained.</w:t>
+      </w:r>
+    </w:p>
+    <w:p>
+      <w:r>
+        <w:t xml:space="preserve">Taken together, these patterns implement in the semantic model the governance principle discussed in Section 4.3 as the second limitation of the pre-existing reporting model: the same metric, asked at different moments or by different users, must return the same value.</w:t>
+      </w:r>
+    </w:p>
+    <w:p>
+      <w:pPr>
+        <w:pStyle w:val="Heading2"/>
+      </w:pPr>
+      <w:r>
+        <w:t xml:space="preserve">5.5 Power BI implementation</w:t>
+      </w:r>
+    </w:p>
+    <w:p>
+      <w:r>
+        <w:t xml:space="preserve">The semantic model and the KPIs described in Sections 5.3 and 5.4 are consumed by a set of Power BI reports that expose the analytical output of the project to academic management. This section describes how the reports are organised, how the interaction with the data is structured across pages, and how the reports are distributed to the users through Power BI Service.</w:t>
+      </w:r>
+    </w:p>
+    <w:p>
+      <w:pPr>
+        <w:pStyle w:val="Heading3"/>
+      </w:pPr>
+      <w:r>
+        <w:t xml:space="preserve">5.5.1 Report organisation</w:t>
+      </w:r>
+    </w:p>
+    <w:p>
+      <w:r>
+        <w:t xml:space="preserve">The Business Intelligence solution is not delivered as a single monolithic report. It is organised as an application that groups six thematic reports, each built on its own semantic model: </w:t>
+      </w:r>
+      <w:r>
+        <w:rPr>
+          <w:rFonts w:ascii="Consolas" w:cs="Consolas" w:eastAsia="Consolas" w:hAnsi="Consolas"/>
+        </w:rPr>
+        <w:t xml:space="preserve">Report_Didattica</w:t>
+      </w:r>
+      <w:r>
+        <w:t xml:space="preserve"> for student careers and academic performance, </w:t>
+      </w:r>
+      <w:r>
+        <w:rPr>
+          <w:rFonts w:ascii="Consolas" w:cs="Consolas" w:eastAsia="Consolas" w:hAnsi="Consolas"/>
+        </w:rPr>
+        <w:t xml:space="preserve">Report_Servizi_Studenti</w:t>
+      </w:r>
+      <w:r>
+        <w:t xml:space="preserve"> for student services, </w:t>
+      </w:r>
+      <w:r>
+        <w:rPr>
+          <w:rFonts w:ascii="Consolas" w:cs="Consolas" w:eastAsia="Consolas" w:hAnsi="Consolas"/>
+        </w:rPr>
+        <w:t xml:space="preserve">Report_Ammissioni</w:t>
+      </w:r>
+      <w:r>
+        <w:t xml:space="preserve"> for admissions, </w:t>
+      </w:r>
+      <w:r>
+        <w:rPr>
+          <w:rFonts w:ascii="Consolas" w:cs="Consolas" w:eastAsia="Consolas" w:hAnsi="Consolas"/>
+        </w:rPr>
+        <w:t xml:space="preserve">Report_Amministrazione_Finanza</w:t>
+      </w:r>
+      <w:r>
+        <w:t xml:space="preserve"> for administration and finance, </w:t>
+      </w:r>
+      <w:r>
+        <w:rPr>
+          <w:rFonts w:ascii="Consolas" w:cs="Consolas" w:eastAsia="Consolas" w:hAnsi="Consolas"/>
+        </w:rPr>
+        <w:t xml:space="preserve">Report_Accreditamento_Qualità</w:t>
+      </w:r>
+      <w:r>
+        <w:t xml:space="preserve"> for accreditation and quality, and </w:t>
+      </w:r>
+      <w:r>
+        <w:rPr>
+          <w:rFonts w:ascii="Consolas" w:cs="Consolas" w:eastAsia="Consolas" w:hAnsi="Consolas"/>
+        </w:rPr>
+        <w:t xml:space="preserve">Report_Frequenze_Aule</w:t>
+      </w:r>
+      <w:r>
+        <w:t xml:space="preserve"> for attendance and classrooms. This organisation was preferred over a single-report design for three reasons: it aligns the boundary of each report with a well-defined semantic model, it keeps the maintenance surface of each report contained, and it allows the differentiation of access rights across audiences to be applied at the level of the individual report rather than at the level of the pages of a shared one.</w:t>
+      </w:r>
+    </w:p>
+    <w:p>
+      <w:r>
+        <w:t xml:space="preserve">The report at the centre of this thesis is </w:t>
+      </w:r>
+      <w:r>
+        <w:rPr>
+          <w:rFonts w:ascii="Consolas" w:cs="Consolas" w:eastAsia="Consolas" w:hAnsi="Consolas"/>
+        </w:rPr>
+        <w:t xml:space="preserve">Report_Didattica</w:t>
+      </w:r>
+      <w:r>
+        <w:t xml:space="preserve">, which corresponds to the student careers domain. It is built on the semantic model documented in Section 5.3 and consumes the KPIs catalogued in Section 5.4. Its pages are organised around the thematic families of the KPI catalogue: pages dedicated to enrolment and population, pages dedicated to academic performance, and pages dedicated to attendance and risk monitoring. The families beyond the direct focus of the thesis (didactic organisation, teaching staff, classrooms) are covered in the KPI catalogue and, where relevant, in the other reports of the application, and are not analysed in detail here, consistently with the scope delimitation stated in Section 4.5.</w:t>
+      </w:r>
+    </w:p>
+    <w:p>
+      <w:pPr>
+        <w:spacing w:after="40" w:before="160"/>
+        <w:jc w:val="center"/>
+      </w:pPr>
+      <w:r>
+        <w:drawing>
+          <wp:inline distT="0" distB="0" distL="0" distR="0">
+            <wp:extent cx="5334000" cy="3038475"/>
+            <wp:effectExtent t="0" r="0" b="0" l="0"/>
+            <wp:docPr id="1" name="" descr="" title=""/>
+            <wp:cNvGraphicFramePr>
+              <a:graphicFrameLocks xmlns:a="http://schemas.openxmlformats.org/drawingml/2006/main" noChangeAspect="1"/>
+            </wp:cNvGraphicFramePr>
+            <a:graphic xmlns:a="http://schemas.openxmlformats.org/drawingml/2006/main">
+              <a:graphicData uri="http://schemas.openxmlformats.org/drawingml/2006/picture">
+                <pic:pic xmlns:pic="http://schemas.openxmlformats.org/drawingml/2006/picture">
+                  <pic:nvPicPr>
+                    <pic:cNvPr id="0" name="" descr=""/>
+                    <pic:cNvPicPr>
+                      <a:picLocks noChangeAspect="1" noChangeArrowheads="1"/>
+                    </pic:cNvPicPr>
+                  </pic:nvPicPr>
+                  <pic:blipFill>
+                    <a:blip r:embed="rId11" cstate="none"/>
+                    <a:srcRect/>
+                    <a:stretch>
+                      <a:fillRect/>
+                    </a:stretch>
+                  </pic:blipFill>
+                  <pic:spPr bwMode="auto">
+                    <a:xfrm>
+                      <a:off x="0" y="0"/>
+                      <a:ext cx="5334000" cy="3038475"/>
+                    </a:xfrm>
+                    <a:prstGeom prst="rect">
+                      <a:avLst/>
+                    </a:prstGeom>
+                  </pic:spPr>
+                </pic:pic>
+              </a:graphicData>
+            </a:graphic>
+          </wp:inline>
+        </w:drawing>
+      </w:r>
+    </w:p>
+    <w:p>
+      <w:pPr>
+        <w:spacing w:after="220"/>
+        <w:jc w:val="center"/>
+      </w:pPr>
+      <w:r>
+        <w:rPr>
+          <w:i/>
+          <w:iCs/>
+          <w:sz w:val="20"/>
+          <w:szCs w:val="20"/>
+        </w:rPr>
+        <w:t xml:space="preserve">Figure 3. The landing page of the Report_Didattica report in the Power BI application, with the navigation to its thematic pages.</w:t>
+      </w:r>
+    </w:p>
+    <w:p>
+      <w:pPr>
+        <w:pStyle w:val="Heading3"/>
+      </w:pPr>
+      <w:r>
+        <w:t xml:space="preserve">5.5.2 Interaction patterns across pages</w:t>
+      </w:r>
+    </w:p>
+    <w:p>
+      <w:r>
+        <w:t xml:space="preserve">The pages of the report follow one of two complementary interaction patterns, depending on the nature of the management question they support.</w:t>
+      </w:r>
+    </w:p>
+    <w:p>
+      <w:r>
+        <w:t xml:space="preserve">The first pattern is the </w:t>
+      </w:r>
+      <w:r>
+        <w:rPr>
+          <w:i/>
+          <w:iCs/>
+        </w:rPr>
         <w:t xml:space="preserve">standing overview</w:t>
       </w:r>
       <w:r>
         <w:t xml:space="preserve">. A standing overview page displays a curated set of KPIs at the aggregated level, typically for the entire institution or for a selected study programme, with slicers that allow the user to change the temporal or the categorical context (academic year, cycle, gender). The user reads the page as a periodic snapshot of the domain, without navigating further. This pattern is applied to the pages that summarise the state of enrolment and of academic performance at the institutional level, where the primary question of the management is one of ongoing monitoring rather than of investigation.</w:t>
+      </w:r>
+    </w:p>
+    <w:p>
+      <w:pPr>
+        <w:spacing w:after="40" w:before="160"/>
+        <w:jc w:val="center"/>
+      </w:pPr>
+      <w:r>
+        <w:drawing>
+          <wp:inline distT="0" distB="0" distL="0" distR="0">
+            <wp:extent cx="5334000" cy="3038475"/>
+            <wp:effectExtent t="0" r="0" b="0" l="0"/>
+            <wp:docPr id="1" name="" descr="" title=""/>
+            <wp:cNvGraphicFramePr>
+              <a:graphicFrameLocks xmlns:a="http://schemas.openxmlformats.org/drawingml/2006/main" noChangeAspect="1"/>
+            </wp:cNvGraphicFramePr>
+            <a:graphic xmlns:a="http://schemas.openxmlformats.org/drawingml/2006/main">
+              <a:graphicData uri="http://schemas.openxmlformats.org/drawingml/2006/picture">
+                <pic:pic xmlns:pic="http://schemas.openxmlformats.org/drawingml/2006/picture">
+                  <pic:nvPicPr>
+                    <pic:cNvPr id="0" name="" descr=""/>
+                    <pic:cNvPicPr>
+                      <a:picLocks noChangeAspect="1" noChangeArrowheads="1"/>
+                    </pic:cNvPicPr>
+                  </pic:nvPicPr>
+                  <pic:blipFill>
+                    <a:blip r:embed="rId12" cstate="none"/>
+                    <a:srcRect/>
+                    <a:stretch>
+                      <a:fillRect/>
+                    </a:stretch>
+                  </pic:blipFill>
+                  <pic:spPr bwMode="auto">
+                    <a:xfrm>
+                      <a:off x="0" y="0"/>
+                      <a:ext cx="5334000" cy="3038475"/>
+                    </a:xfrm>
+                    <a:prstGeom prst="rect">
+                      <a:avLst/>
+                    </a:prstGeom>
+                  </pic:spPr>
+                </pic:pic>
+              </a:graphicData>
+            </a:graphic>
+          </wp:inline>
+        </w:drawing>
+      </w:r>
+    </w:p>
+    <w:p>
+      <w:pPr>
+        <w:spacing w:after="220"/>
+        <w:jc w:val="center"/>
+      </w:pPr>
+      <w:r>
+        <w:rPr>
+          <w:i/>
+          <w:iCs/>
+          <w:sz w:val="20"/>
+          <w:szCs w:val="20"/>
+        </w:rPr>
+        <w:t xml:space="preserve">Figure 4. A standing overview page of Report_Didattica (enrolment and population): KPI cards and charts at the institutional level, with slicers on the left.</w:t>
       </w:r>
     </w:p>
     <w:p>

</xml_diff>